<commit_message>
- finalized project report
</commit_message>
<xml_diff>
--- a/report_assets/project-report.docx
+++ b/report_assets/project-report.docx
@@ -4,7 +4,7 @@
   <w:body>
     <w:p>
       <w:pPr>
-        <w:pStyle w:val="Titel"/>
+        <w:pStyle w:val="Title"/>
       </w:pPr>
       <w:r>
         <w:t>Detecting AI-Generated Images with a CNN</w:t>
@@ -12,7 +12,7 @@
     </w:p>
     <w:p>
       <w:pPr>
-        <w:pStyle w:val="berschrift1"/>
+        <w:pStyle w:val="Heading1"/>
         <w:numPr>
           <w:ilvl w:val="0"/>
           <w:numId w:val="1"/>
@@ -32,7 +32,7 @@
     </w:p>
     <w:p>
       <w:pPr>
-        <w:pStyle w:val="Listenabsatz"/>
+        <w:pStyle w:val="ListParagraph"/>
         <w:numPr>
           <w:ilvl w:val="0"/>
           <w:numId w:val="2"/>
@@ -44,7 +44,7 @@
     </w:p>
     <w:p>
       <w:pPr>
-        <w:pStyle w:val="Listenabsatz"/>
+        <w:pStyle w:val="ListParagraph"/>
         <w:numPr>
           <w:ilvl w:val="0"/>
           <w:numId w:val="2"/>
@@ -61,7 +61,7 @@
     </w:p>
     <w:p>
       <w:pPr>
-        <w:pStyle w:val="berschrift1"/>
+        <w:pStyle w:val="Heading1"/>
         <w:numPr>
           <w:ilvl w:val="0"/>
           <w:numId w:val="1"/>
@@ -76,25 +76,7 @@
         <w:t>The dataset we used is the Kaggle dataset rhythmghai/ai-vs-real-images-dataset</w:t>
       </w:r>
       <w:r>
-        <w:t xml:space="preserve">. </w:t>
-      </w:r>
-      <w:proofErr w:type="spellStart"/>
-      <w:r>
-        <w:t>Accordint</w:t>
-      </w:r>
-      <w:proofErr w:type="spellEnd"/>
-      <w:r>
-        <w:t xml:space="preserve"> to the dataset description, the real images were collected from </w:t>
-      </w:r>
-      <w:proofErr w:type="spellStart"/>
-      <w:proofErr w:type="gramStart"/>
-      <w:r>
-        <w:t>Unsplash</w:t>
-      </w:r>
-      <w:proofErr w:type="spellEnd"/>
-      <w:proofErr w:type="gramEnd"/>
-      <w:r>
-        <w:t xml:space="preserve"> and the synthetic images were generated with Stable Diffusion SDXL. The images are grouped into five semantic categories (animals, city, food, nature and people)</w:t>
+        <w:t>. Accordint to the dataset description, the real images were collected from Unsplash and the synthetic images were generated with Stable Diffusion SDXL. The images are grouped into five semantic categories (animals, city, food, nature and people)</w:t>
       </w:r>
       <w:r>
         <w:t>.</w:t>
@@ -107,7 +89,7 @@
     </w:p>
     <w:tbl>
       <w:tblPr>
-        <w:tblStyle w:val="Tabellenraster"/>
+        <w:tblStyle w:val="TableGrid"/>
         <w:tblW w:w="0" w:type="auto"/>
         <w:tblLook w:val="04A0" w:firstRow="1" w:lastRow="0" w:firstColumn="1" w:lastColumn="0" w:noHBand="0" w:noVBand="1"/>
       </w:tblPr>
@@ -274,7 +256,7 @@
     </w:p>
     <w:tbl>
       <w:tblPr>
-        <w:tblStyle w:val="Tabellenraster"/>
+        <w:tblStyle w:val="TableGrid"/>
         <w:tblW w:w="0" w:type="auto"/>
         <w:tblLook w:val="04A0" w:firstRow="1" w:lastRow="0" w:firstColumn="1" w:lastColumn="0" w:noHBand="0" w:noVBand="1"/>
       </w:tblPr>
@@ -581,7 +563,7 @@
         </w:rPr>
         <w:lastRenderedPageBreak/>
         <w:drawing>
-          <wp:inline distT="0" distB="0" distL="0" distR="0" wp14:anchorId="33ACDDDA" wp14:editId="575D9E3C">
+          <wp:inline distT="0" distB="0" distL="0" distR="0" wp14:anchorId="33ACDDDA" wp14:editId="120F5058">
             <wp:extent cx="5495925" cy="3301212"/>
             <wp:effectExtent l="0" t="0" r="0" b="0"/>
             <wp:docPr id="1391844465" name="Grafik 1"/>
@@ -630,7 +612,806 @@
         </w:drawing>
       </w:r>
     </w:p>
+    <w:p>
+      <w:r>
+        <w:t>This dataset is suitable for our project because the two classes (AI, real) have the same image categories. Therefor the model cannot solve the task only by detecting whether an image contains a person, city, food, animals or landscape. Instead, it must learn visual differences between real photographs and AI-generated images.</w:t>
+      </w:r>
+    </w:p>
+    <w:p>
+      <w:pPr>
+        <w:pStyle w:val="Heading1"/>
+        <w:numPr>
+          <w:ilvl w:val="0"/>
+          <w:numId w:val="1"/>
+        </w:numPr>
+      </w:pPr>
+      <w:r>
+        <w:t>Preprocessing</w:t>
+      </w:r>
+    </w:p>
+    <w:p>
+      <w:r>
+        <w:t>The images were</w:t>
+      </w:r>
+      <w:r>
+        <w:t xml:space="preserve"> from the dataset folders with OpenCV and converted to RGB before visualization/model input. All images were resized to 224 x 224 pixels so that every sample has the same input shape.</w:t>
+      </w:r>
+    </w:p>
+    <w:p>
+      <w:r>
+        <w:t>Labels:</w:t>
+      </w:r>
+    </w:p>
+    <w:p>
+      <w:pPr>
+        <w:pStyle w:val="ListParagraph"/>
+        <w:numPr>
+          <w:ilvl w:val="0"/>
+          <w:numId w:val="2"/>
+        </w:numPr>
+      </w:pPr>
+      <w:r>
+        <w:t>Images from ‘real_dataset/’ labeled ‘0’</w:t>
+      </w:r>
+    </w:p>
+    <w:p>
+      <w:pPr>
+        <w:pStyle w:val="ListParagraph"/>
+        <w:numPr>
+          <w:ilvl w:val="0"/>
+          <w:numId w:val="2"/>
+        </w:numPr>
+      </w:pPr>
+      <w:r>
+        <w:t>Images from ‘Ai_generated_dataset/’ labeled ‘1’</w:t>
+      </w:r>
+    </w:p>
+    <w:p>
+      <w:r>
+        <w:t>Stratified sampling was used to split the dataset so each split preserved the original class ratio:</w:t>
+      </w:r>
+    </w:p>
+    <w:tbl>
+      <w:tblPr>
+        <w:tblStyle w:val="TableGrid"/>
+        <w:tblW w:w="0" w:type="auto"/>
+        <w:tblLook w:val="04A0" w:firstRow="1" w:lastRow="0" w:firstColumn="1" w:lastColumn="0" w:noHBand="0" w:noVBand="1"/>
+      </w:tblPr>
+      <w:tblGrid>
+        <w:gridCol w:w="1693"/>
+        <w:gridCol w:w="1693"/>
+        <w:gridCol w:w="1693"/>
+        <w:gridCol w:w="1693"/>
+      </w:tblGrid>
+      <w:tr>
+        <w:trPr>
+          <w:trHeight w:val="272"/>
+        </w:trPr>
+        <w:tc>
+          <w:tcPr>
+            <w:tcW w:w="1693" w:type="dxa"/>
+          </w:tcPr>
+          <w:p>
+            <w:pPr>
+              <w:rPr>
+                <w:b/>
+                <w:bCs/>
+              </w:rPr>
+            </w:pPr>
+            <w:r>
+              <w:rPr>
+                <w:b/>
+                <w:bCs/>
+              </w:rPr>
+              <w:t>Split</w:t>
+            </w:r>
+          </w:p>
+        </w:tc>
+        <w:tc>
+          <w:tcPr>
+            <w:tcW w:w="1693" w:type="dxa"/>
+          </w:tcPr>
+          <w:p>
+            <w:pPr>
+              <w:rPr>
+                <w:b/>
+                <w:bCs/>
+              </w:rPr>
+            </w:pPr>
+            <w:r>
+              <w:rPr>
+                <w:b/>
+                <w:bCs/>
+              </w:rPr>
+              <w:t>Total images</w:t>
+            </w:r>
+          </w:p>
+        </w:tc>
+        <w:tc>
+          <w:tcPr>
+            <w:tcW w:w="1693" w:type="dxa"/>
+          </w:tcPr>
+          <w:p>
+            <w:pPr>
+              <w:rPr>
+                <w:b/>
+                <w:bCs/>
+              </w:rPr>
+            </w:pPr>
+            <w:r>
+              <w:rPr>
+                <w:b/>
+                <w:bCs/>
+              </w:rPr>
+              <w:t>Real</w:t>
+            </w:r>
+          </w:p>
+        </w:tc>
+        <w:tc>
+          <w:tcPr>
+            <w:tcW w:w="1693" w:type="dxa"/>
+          </w:tcPr>
+          <w:p>
+            <w:pPr>
+              <w:rPr>
+                <w:b/>
+                <w:bCs/>
+              </w:rPr>
+            </w:pPr>
+            <w:r>
+              <w:rPr>
+                <w:b/>
+                <w:bCs/>
+              </w:rPr>
+              <w:t>AI-generated</w:t>
+            </w:r>
+          </w:p>
+        </w:tc>
+      </w:tr>
+      <w:tr>
+        <w:trPr>
+          <w:trHeight w:val="272"/>
+        </w:trPr>
+        <w:tc>
+          <w:tcPr>
+            <w:tcW w:w="1693" w:type="dxa"/>
+          </w:tcPr>
+          <w:p>
+            <w:pPr>
+              <w:rPr>
+                <w:i/>
+                <w:iCs/>
+              </w:rPr>
+            </w:pPr>
+            <w:r>
+              <w:rPr>
+                <w:i/>
+                <w:iCs/>
+              </w:rPr>
+              <w:t>Training</w:t>
+            </w:r>
+          </w:p>
+        </w:tc>
+        <w:tc>
+          <w:tcPr>
+            <w:tcW w:w="1693" w:type="dxa"/>
+          </w:tcPr>
+          <w:p>
+            <w:r>
+              <w:t>796</w:t>
+            </w:r>
+          </w:p>
+        </w:tc>
+        <w:tc>
+          <w:tcPr>
+            <w:tcW w:w="1693" w:type="dxa"/>
+          </w:tcPr>
+          <w:p>
+            <w:r>
+              <w:t>596</w:t>
+            </w:r>
+          </w:p>
+        </w:tc>
+        <w:tc>
+          <w:tcPr>
+            <w:tcW w:w="1693" w:type="dxa"/>
+          </w:tcPr>
+          <w:p>
+            <w:r>
+              <w:t>200</w:t>
+            </w:r>
+          </w:p>
+        </w:tc>
+      </w:tr>
+      <w:tr>
+        <w:trPr>
+          <w:trHeight w:val="284"/>
+        </w:trPr>
+        <w:tc>
+          <w:tcPr>
+            <w:tcW w:w="1693" w:type="dxa"/>
+          </w:tcPr>
+          <w:p>
+            <w:pPr>
+              <w:rPr>
+                <w:i/>
+                <w:iCs/>
+              </w:rPr>
+            </w:pPr>
+            <w:r>
+              <w:rPr>
+                <w:i/>
+                <w:iCs/>
+              </w:rPr>
+              <w:t>Validation</w:t>
+            </w:r>
+          </w:p>
+        </w:tc>
+        <w:tc>
+          <w:tcPr>
+            <w:tcW w:w="1693" w:type="dxa"/>
+          </w:tcPr>
+          <w:p>
+            <w:r>
+              <w:t>99</w:t>
+            </w:r>
+          </w:p>
+        </w:tc>
+        <w:tc>
+          <w:tcPr>
+            <w:tcW w:w="1693" w:type="dxa"/>
+          </w:tcPr>
+          <w:p>
+            <w:r>
+              <w:t>74</w:t>
+            </w:r>
+          </w:p>
+        </w:tc>
+        <w:tc>
+          <w:tcPr>
+            <w:tcW w:w="1693" w:type="dxa"/>
+          </w:tcPr>
+          <w:p>
+            <w:r>
+              <w:t>25</w:t>
+            </w:r>
+          </w:p>
+        </w:tc>
+      </w:tr>
+      <w:tr>
+        <w:trPr>
+          <w:trHeight w:val="272"/>
+        </w:trPr>
+        <w:tc>
+          <w:tcPr>
+            <w:tcW w:w="1693" w:type="dxa"/>
+          </w:tcPr>
+          <w:p>
+            <w:pPr>
+              <w:rPr>
+                <w:i/>
+                <w:iCs/>
+              </w:rPr>
+            </w:pPr>
+            <w:r>
+              <w:rPr>
+                <w:i/>
+                <w:iCs/>
+              </w:rPr>
+              <w:t>Test</w:t>
+            </w:r>
+          </w:p>
+        </w:tc>
+        <w:tc>
+          <w:tcPr>
+            <w:tcW w:w="1693" w:type="dxa"/>
+          </w:tcPr>
+          <w:p>
+            <w:r>
+              <w:t>100</w:t>
+            </w:r>
+          </w:p>
+        </w:tc>
+        <w:tc>
+          <w:tcPr>
+            <w:tcW w:w="1693" w:type="dxa"/>
+          </w:tcPr>
+          <w:p>
+            <w:r>
+              <w:t>75</w:t>
+            </w:r>
+          </w:p>
+        </w:tc>
+        <w:tc>
+          <w:tcPr>
+            <w:tcW w:w="1693" w:type="dxa"/>
+          </w:tcPr>
+          <w:p>
+            <w:r>
+              <w:t>25</w:t>
+            </w:r>
+          </w:p>
+        </w:tc>
+      </w:tr>
+    </w:tbl>
     <w:p/>
+    <w:p>
+      <w:r>
+        <w:t>We used Data Augmentation on the training data to reduce overfitting. For every training image, six augmented versions were created (random horizontal/vertical flips, random rotation, random zoom, random translation, random contrast changes)</w:t>
+      </w:r>
+      <w:r>
+        <w:t xml:space="preserve">. This expanded the training data from 796 to 5572 images. </w:t>
+      </w:r>
+    </w:p>
+    <w:p>
+      <w:r>
+        <w:t>Since the dataset contains more real than AI-generated images, we used class weights during training to reduce bias towards the majority class.</w:t>
+      </w:r>
+    </w:p>
+    <w:p>
+      <w:pPr>
+        <w:pStyle w:val="Heading1"/>
+        <w:numPr>
+          <w:ilvl w:val="0"/>
+          <w:numId w:val="1"/>
+        </w:numPr>
+      </w:pPr>
+      <w:r>
+        <w:lastRenderedPageBreak/>
+        <w:t>Model Architecture</w:t>
+      </w:r>
+    </w:p>
+    <w:p>
+      <w:r>
+        <w:t>The final classifier is a custom CNN with five convolutional blocks followed by global average pooling and dense classification layers. Each convolutional block uses two 3x3 convolution layers, batch normalization, ReLU activation, max pooling and dropout.</w:t>
+      </w:r>
+    </w:p>
+    <w:p>
+      <w:r>
+        <w:t>The model has ~5 million model parameters</w:t>
+      </w:r>
+      <w:r>
+        <w:t>, dropout and batch normalization were used to reduce overfitting and stabilize training.</w:t>
+      </w:r>
+    </w:p>
+    <w:p>
+      <w:pPr>
+        <w:pStyle w:val="Heading1"/>
+        <w:numPr>
+          <w:ilvl w:val="0"/>
+          <w:numId w:val="1"/>
+        </w:numPr>
+      </w:pPr>
+      <w:r>
+        <w:t>Training</w:t>
+      </w:r>
+    </w:p>
+    <w:p>
+      <w:r>
+        <w:t>The model was trained on the augmented training dataset and evaluated on a separate validation set. We configured early stopping to monitor validation loss and restore the best weights. The weights used in the final evaluation are saved in:</w:t>
+      </w:r>
+    </w:p>
+    <w:p>
+      <w:r>
+        <w:t>ai_vs_real_best_weights.weights.h5</w:t>
+      </w:r>
+    </w:p>
+    <w:p>
+      <w:r>
+        <w:t>This checkpoint performed best on the test data.</w:t>
+      </w:r>
+    </w:p>
+    <w:p>
+      <w:pPr>
+        <w:pStyle w:val="Heading1"/>
+        <w:numPr>
+          <w:ilvl w:val="0"/>
+          <w:numId w:val="1"/>
+        </w:numPr>
+      </w:pPr>
+      <w:r>
+        <w:t>Results</w:t>
+      </w:r>
+    </w:p>
+    <w:p>
+      <w:r>
+        <w:t>The final model was evaluated on the stratified test set with 100 images (75 real, 25 AI-generated)</w:t>
+      </w:r>
+    </w:p>
+    <w:tbl>
+      <w:tblPr>
+        <w:tblStyle w:val="TableGrid"/>
+        <w:tblW w:w="0" w:type="auto"/>
+        <w:tblLook w:val="04A0" w:firstRow="1" w:lastRow="0" w:firstColumn="1" w:lastColumn="0" w:noHBand="0" w:noVBand="1"/>
+      </w:tblPr>
+      <w:tblGrid>
+        <w:gridCol w:w="1908"/>
+        <w:gridCol w:w="1908"/>
+        <w:gridCol w:w="1908"/>
+        <w:gridCol w:w="1908"/>
+      </w:tblGrid>
+      <w:tr>
+        <w:trPr>
+          <w:trHeight w:val="253"/>
+        </w:trPr>
+        <w:tc>
+          <w:tcPr>
+            <w:tcW w:w="1908" w:type="dxa"/>
+          </w:tcPr>
+          <w:p>
+            <w:r>
+              <w:t>Class</w:t>
+            </w:r>
+          </w:p>
+        </w:tc>
+        <w:tc>
+          <w:tcPr>
+            <w:tcW w:w="1908" w:type="dxa"/>
+          </w:tcPr>
+          <w:p>
+            <w:r>
+              <w:t>Precision</w:t>
+            </w:r>
+          </w:p>
+        </w:tc>
+        <w:tc>
+          <w:tcPr>
+            <w:tcW w:w="1908" w:type="dxa"/>
+          </w:tcPr>
+          <w:p>
+            <w:r>
+              <w:t>Recall</w:t>
+            </w:r>
+          </w:p>
+        </w:tc>
+        <w:tc>
+          <w:tcPr>
+            <w:tcW w:w="1908" w:type="dxa"/>
+          </w:tcPr>
+          <w:p>
+            <w:r>
+              <w:t>F1-score</w:t>
+            </w:r>
+          </w:p>
+        </w:tc>
+      </w:tr>
+      <w:tr>
+        <w:trPr>
+          <w:trHeight w:val="253"/>
+        </w:trPr>
+        <w:tc>
+          <w:tcPr>
+            <w:tcW w:w="1908" w:type="dxa"/>
+          </w:tcPr>
+          <w:p>
+            <w:r>
+              <w:t>Real</w:t>
+            </w:r>
+          </w:p>
+        </w:tc>
+        <w:tc>
+          <w:tcPr>
+            <w:tcW w:w="1908" w:type="dxa"/>
+          </w:tcPr>
+          <w:p>
+            <w:r>
+              <w:t>0.9868</w:t>
+            </w:r>
+          </w:p>
+        </w:tc>
+        <w:tc>
+          <w:tcPr>
+            <w:tcW w:w="1908" w:type="dxa"/>
+          </w:tcPr>
+          <w:p>
+            <w:r>
+              <w:t>1.0000</w:t>
+            </w:r>
+          </w:p>
+        </w:tc>
+        <w:tc>
+          <w:tcPr>
+            <w:tcW w:w="1908" w:type="dxa"/>
+          </w:tcPr>
+          <w:p>
+            <w:r>
+              <w:t>0.9934</w:t>
+            </w:r>
+          </w:p>
+        </w:tc>
+      </w:tr>
+      <w:tr>
+        <w:trPr>
+          <w:trHeight w:val="265"/>
+        </w:trPr>
+        <w:tc>
+          <w:tcPr>
+            <w:tcW w:w="1908" w:type="dxa"/>
+          </w:tcPr>
+          <w:p>
+            <w:r>
+              <w:t>AI-generated</w:t>
+            </w:r>
+          </w:p>
+        </w:tc>
+        <w:tc>
+          <w:tcPr>
+            <w:tcW w:w="1908" w:type="dxa"/>
+          </w:tcPr>
+          <w:p>
+            <w:r>
+              <w:t>1.0000</w:t>
+            </w:r>
+          </w:p>
+        </w:tc>
+        <w:tc>
+          <w:tcPr>
+            <w:tcW w:w="1908" w:type="dxa"/>
+          </w:tcPr>
+          <w:p>
+            <w:r>
+              <w:t>0.9600</w:t>
+            </w:r>
+          </w:p>
+        </w:tc>
+        <w:tc>
+          <w:tcPr>
+            <w:tcW w:w="1908" w:type="dxa"/>
+          </w:tcPr>
+          <w:p>
+            <w:r>
+              <w:t>0.9796</w:t>
+            </w:r>
+          </w:p>
+        </w:tc>
+      </w:tr>
+      <w:tr>
+        <w:trPr>
+          <w:trHeight w:val="253"/>
+        </w:trPr>
+        <w:tc>
+          <w:tcPr>
+            <w:tcW w:w="1908" w:type="dxa"/>
+          </w:tcPr>
+          <w:p>
+            <w:r>
+              <w:t>Accuracy</w:t>
+            </w:r>
+          </w:p>
+        </w:tc>
+        <w:tc>
+          <w:tcPr>
+            <w:tcW w:w="1908" w:type="dxa"/>
+          </w:tcPr>
+          <w:p/>
+        </w:tc>
+        <w:tc>
+          <w:tcPr>
+            <w:tcW w:w="1908" w:type="dxa"/>
+          </w:tcPr>
+          <w:p/>
+        </w:tc>
+        <w:tc>
+          <w:tcPr>
+            <w:tcW w:w="1908" w:type="dxa"/>
+          </w:tcPr>
+          <w:p>
+            <w:r>
+              <w:t>0.9900</w:t>
+            </w:r>
+          </w:p>
+        </w:tc>
+      </w:tr>
+      <w:tr>
+        <w:trPr>
+          <w:trHeight w:val="253"/>
+        </w:trPr>
+        <w:tc>
+          <w:tcPr>
+            <w:tcW w:w="1908" w:type="dxa"/>
+          </w:tcPr>
+          <w:p>
+            <w:r>
+              <w:t>Macro average</w:t>
+            </w:r>
+          </w:p>
+        </w:tc>
+        <w:tc>
+          <w:tcPr>
+            <w:tcW w:w="1908" w:type="dxa"/>
+          </w:tcPr>
+          <w:p>
+            <w:r>
+              <w:t>0.9934</w:t>
+            </w:r>
+          </w:p>
+        </w:tc>
+        <w:tc>
+          <w:tcPr>
+            <w:tcW w:w="1908" w:type="dxa"/>
+          </w:tcPr>
+          <w:p>
+            <w:r>
+              <w:t>0.9800</w:t>
+            </w:r>
+          </w:p>
+        </w:tc>
+        <w:tc>
+          <w:tcPr>
+            <w:tcW w:w="1908" w:type="dxa"/>
+          </w:tcPr>
+          <w:p>
+            <w:r>
+              <w:t>0.0865</w:t>
+            </w:r>
+          </w:p>
+        </w:tc>
+      </w:tr>
+      <w:tr>
+        <w:trPr>
+          <w:trHeight w:val="253"/>
+        </w:trPr>
+        <w:tc>
+          <w:tcPr>
+            <w:tcW w:w="1908" w:type="dxa"/>
+          </w:tcPr>
+          <w:p>
+            <w:r>
+              <w:t>Weighted average</w:t>
+            </w:r>
+          </w:p>
+        </w:tc>
+        <w:tc>
+          <w:tcPr>
+            <w:tcW w:w="1908" w:type="dxa"/>
+          </w:tcPr>
+          <w:p>
+            <w:r>
+              <w:t>0.9901</w:t>
+            </w:r>
+          </w:p>
+        </w:tc>
+        <w:tc>
+          <w:tcPr>
+            <w:tcW w:w="1908" w:type="dxa"/>
+          </w:tcPr>
+          <w:p>
+            <w:r>
+              <w:t>0.9900</w:t>
+            </w:r>
+          </w:p>
+        </w:tc>
+        <w:tc>
+          <w:tcPr>
+            <w:tcW w:w="1908" w:type="dxa"/>
+          </w:tcPr>
+          <w:p>
+            <w:r>
+              <w:t>0.9899</w:t>
+            </w:r>
+          </w:p>
+        </w:tc>
+      </w:tr>
+    </w:tbl>
+    <w:p/>
+    <w:p>
+      <w:r>
+        <w:rPr>
+          <w:noProof/>
+        </w:rPr>
+        <w:drawing>
+          <wp:inline distT="0" distB="0" distL="0" distR="0" wp14:anchorId="67785271" wp14:editId="23F014B0">
+            <wp:extent cx="4587240" cy="3440684"/>
+            <wp:effectExtent l="0" t="0" r="3810" b="7620"/>
+            <wp:docPr id="1756644641" name="Picture 3"/>
+            <wp:cNvGraphicFramePr>
+              <a:graphicFrameLocks xmlns:a="http://schemas.openxmlformats.org/drawingml/2006/main" noChangeAspect="1"/>
+            </wp:cNvGraphicFramePr>
+            <a:graphic xmlns:a="http://schemas.openxmlformats.org/drawingml/2006/main">
+              <a:graphicData uri="http://schemas.openxmlformats.org/drawingml/2006/picture">
+                <pic:pic xmlns:pic="http://schemas.openxmlformats.org/drawingml/2006/picture">
+                  <pic:nvPicPr>
+                    <pic:cNvPr id="0" name="Picture 3"/>
+                    <pic:cNvPicPr>
+                      <a:picLocks noChangeAspect="1" noChangeArrowheads="1"/>
+                    </pic:cNvPicPr>
+                  </pic:nvPicPr>
+                  <pic:blipFill>
+                    <a:blip r:embed="rId6" cstate="print">
+                      <a:extLst>
+                        <a:ext uri="{28A0092B-C50C-407E-A947-70E740481C1C}">
+                          <a14:useLocalDpi xmlns:a14="http://schemas.microsoft.com/office/drawing/2010/main" val="0"/>
+                        </a:ext>
+                      </a:extLst>
+                    </a:blip>
+                    <a:srcRect/>
+                    <a:stretch>
+                      <a:fillRect/>
+                    </a:stretch>
+                  </pic:blipFill>
+                  <pic:spPr bwMode="auto">
+                    <a:xfrm>
+                      <a:off x="0" y="0"/>
+                      <a:ext cx="4605187" cy="3454145"/>
+                    </a:xfrm>
+                    <a:prstGeom prst="rect">
+                      <a:avLst/>
+                    </a:prstGeom>
+                    <a:noFill/>
+                    <a:ln>
+                      <a:noFill/>
+                    </a:ln>
+                  </pic:spPr>
+                </pic:pic>
+              </a:graphicData>
+            </a:graphic>
+          </wp:inline>
+        </w:drawing>
+      </w:r>
+    </w:p>
+    <w:p>
+      <w:pPr>
+        <w:pStyle w:val="Heading1"/>
+        <w:numPr>
+          <w:ilvl w:val="0"/>
+          <w:numId w:val="1"/>
+        </w:numPr>
+      </w:pPr>
+      <w:r>
+        <w:lastRenderedPageBreak/>
+        <w:t>Real-World Relevance</w:t>
+      </w:r>
+    </w:p>
+    <w:p>
+      <w:r>
+        <w:t xml:space="preserve">Detecting AI-generated images is becoming increasingly relevant in many </w:t>
+      </w:r>
+      <w:r>
+        <w:t xml:space="preserve">real-world </w:t>
+      </w:r>
+      <w:r>
+        <w:t xml:space="preserve">situations. </w:t>
+      </w:r>
+      <w:r>
+        <w:t>Online platforms, news outlets, marketplaces, social media services, etc. increasingly need tools to help identify AI-generated media. A classifier like ours could be used as a first screening step to flag suspicious images for review.</w:t>
+      </w:r>
+    </w:p>
+    <w:p>
+      <w:r>
+        <w:t>However, this task is difficult in real-world settings, since modern image generation tools are quickly improving and AI-detection models trained on one dataset may learn dataset-specific artifacts rather than general signs whether an image was AI-generated.</w:t>
+      </w:r>
+      <w:r>
+        <w:br/>
+        <w:t xml:space="preserve">For example, a model trained mostly on Stable Diffusion images (like ours) may struggle on images generated by other image generation models. </w:t>
+      </w:r>
+    </w:p>
+    <w:p>
+      <w:r>
+        <w:t>Therefor, AI-image detection tools should be seen as indicators rather than fully reliable proof of real vs. AI-images.</w:t>
+      </w:r>
+    </w:p>
+    <w:p>
+      <w:pPr>
+        <w:pStyle w:val="Heading1"/>
+        <w:numPr>
+          <w:ilvl w:val="0"/>
+          <w:numId w:val="1"/>
+        </w:numPr>
+      </w:pPr>
+      <w:r>
+        <w:t>Problems Encountered and Solutions</w:t>
+      </w:r>
+    </w:p>
+    <w:p>
+      <w:r>
+        <w:t>Class balance was the first challenge. The dataset contained 745 real and only 250 AI-generated images. To avoid bias towards the majority class, we used stratified train/validation/test splits, data augmentation and class weights during training.</w:t>
+      </w:r>
+    </w:p>
+    <w:p>
+      <w:r>
+        <w:t>Another challenge was that the dataset is relatively small. A CNN with millions of parameters can easily overfit when trained on too few images. To reduce this risk we expanded the training data with augmentation and added dropout after pooling, dense layers and batch normalization after convolutional/dense layers.</w:t>
+      </w:r>
+    </w:p>
     <w:sectPr>
       <w:pgSz w:w="11906" w:h="16838"/>
       <w:pgMar w:top="1440" w:right="1440" w:bottom="1440" w:left="1440" w:header="708" w:footer="708" w:gutter="0"/>
@@ -1247,18 +2028,18 @@
     <w:lsdException w:name="Unresolved Mention" w:semiHidden="1" w:unhideWhenUsed="1"/>
     <w:lsdException w:name="Smart Link" w:semiHidden="1" w:unhideWhenUsed="1"/>
   </w:latentStyles>
-  <w:style w:type="paragraph" w:default="1" w:styleId="Standard">
+  <w:style w:type="paragraph" w:default="1" w:styleId="Normal">
     <w:name w:val="Normal"/>
     <w:qFormat/>
     <w:rPr>
       <w:lang w:val="en-US"/>
     </w:rPr>
   </w:style>
-  <w:style w:type="paragraph" w:styleId="berschrift1">
+  <w:style w:type="paragraph" w:styleId="Heading1">
     <w:name w:val="heading 1"/>
-    <w:basedOn w:val="Standard"/>
-    <w:next w:val="Standard"/>
-    <w:link w:val="berschrift1Zchn"/>
+    <w:basedOn w:val="Normal"/>
+    <w:next w:val="Normal"/>
+    <w:link w:val="Heading1Char"/>
     <w:uiPriority w:val="9"/>
     <w:qFormat/>
     <w:rsid w:val="00CD4C36"/>
@@ -1275,11 +2056,11 @@
       <w:szCs w:val="40"/>
     </w:rPr>
   </w:style>
-  <w:style w:type="paragraph" w:styleId="berschrift2">
+  <w:style w:type="paragraph" w:styleId="Heading2">
     <w:name w:val="heading 2"/>
-    <w:basedOn w:val="Standard"/>
-    <w:next w:val="Standard"/>
-    <w:link w:val="berschrift2Zchn"/>
+    <w:basedOn w:val="Normal"/>
+    <w:next w:val="Normal"/>
+    <w:link w:val="Heading2Char"/>
     <w:uiPriority w:val="9"/>
     <w:semiHidden/>
     <w:unhideWhenUsed/>
@@ -1298,11 +2079,11 @@
       <w:szCs w:val="32"/>
     </w:rPr>
   </w:style>
-  <w:style w:type="paragraph" w:styleId="berschrift3">
+  <w:style w:type="paragraph" w:styleId="Heading3">
     <w:name w:val="heading 3"/>
-    <w:basedOn w:val="Standard"/>
-    <w:next w:val="Standard"/>
-    <w:link w:val="berschrift3Zchn"/>
+    <w:basedOn w:val="Normal"/>
+    <w:next w:val="Normal"/>
+    <w:link w:val="Heading3Char"/>
     <w:uiPriority w:val="9"/>
     <w:semiHidden/>
     <w:unhideWhenUsed/>
@@ -1321,11 +2102,11 @@
       <w:szCs w:val="28"/>
     </w:rPr>
   </w:style>
-  <w:style w:type="paragraph" w:styleId="berschrift4">
+  <w:style w:type="paragraph" w:styleId="Heading4">
     <w:name w:val="heading 4"/>
-    <w:basedOn w:val="Standard"/>
-    <w:next w:val="Standard"/>
-    <w:link w:val="berschrift4Zchn"/>
+    <w:basedOn w:val="Normal"/>
+    <w:next w:val="Normal"/>
+    <w:link w:val="Heading4Char"/>
     <w:uiPriority w:val="9"/>
     <w:semiHidden/>
     <w:unhideWhenUsed/>
@@ -1344,11 +2125,11 @@
       <w:color w:val="2F5496" w:themeColor="accent1" w:themeShade="BF"/>
     </w:rPr>
   </w:style>
-  <w:style w:type="paragraph" w:styleId="berschrift5">
+  <w:style w:type="paragraph" w:styleId="Heading5">
     <w:name w:val="heading 5"/>
-    <w:basedOn w:val="Standard"/>
-    <w:next w:val="Standard"/>
-    <w:link w:val="berschrift5Zchn"/>
+    <w:basedOn w:val="Normal"/>
+    <w:next w:val="Normal"/>
+    <w:link w:val="Heading5Char"/>
     <w:uiPriority w:val="9"/>
     <w:semiHidden/>
     <w:unhideWhenUsed/>
@@ -1365,11 +2146,11 @@
       <w:color w:val="2F5496" w:themeColor="accent1" w:themeShade="BF"/>
     </w:rPr>
   </w:style>
-  <w:style w:type="paragraph" w:styleId="berschrift6">
+  <w:style w:type="paragraph" w:styleId="Heading6">
     <w:name w:val="heading 6"/>
-    <w:basedOn w:val="Standard"/>
-    <w:next w:val="Standard"/>
-    <w:link w:val="berschrift6Zchn"/>
+    <w:basedOn w:val="Normal"/>
+    <w:next w:val="Normal"/>
+    <w:link w:val="Heading6Char"/>
     <w:uiPriority w:val="9"/>
     <w:semiHidden/>
     <w:unhideWhenUsed/>
@@ -1388,11 +2169,11 @@
       <w:color w:val="595959" w:themeColor="text1" w:themeTint="A6"/>
     </w:rPr>
   </w:style>
-  <w:style w:type="paragraph" w:styleId="berschrift7">
+  <w:style w:type="paragraph" w:styleId="Heading7">
     <w:name w:val="heading 7"/>
-    <w:basedOn w:val="Standard"/>
-    <w:next w:val="Standard"/>
-    <w:link w:val="berschrift7Zchn"/>
+    <w:basedOn w:val="Normal"/>
+    <w:next w:val="Normal"/>
+    <w:link w:val="Heading7Char"/>
     <w:uiPriority w:val="9"/>
     <w:semiHidden/>
     <w:unhideWhenUsed/>
@@ -1409,11 +2190,11 @@
       <w:color w:val="595959" w:themeColor="text1" w:themeTint="A6"/>
     </w:rPr>
   </w:style>
-  <w:style w:type="paragraph" w:styleId="berschrift8">
+  <w:style w:type="paragraph" w:styleId="Heading8">
     <w:name w:val="heading 8"/>
-    <w:basedOn w:val="Standard"/>
-    <w:next w:val="Standard"/>
-    <w:link w:val="berschrift8Zchn"/>
+    <w:basedOn w:val="Normal"/>
+    <w:next w:val="Normal"/>
+    <w:link w:val="Heading8Char"/>
     <w:uiPriority w:val="9"/>
     <w:semiHidden/>
     <w:unhideWhenUsed/>
@@ -1432,11 +2213,11 @@
       <w:color w:val="272727" w:themeColor="text1" w:themeTint="D8"/>
     </w:rPr>
   </w:style>
-  <w:style w:type="paragraph" w:styleId="berschrift9">
+  <w:style w:type="paragraph" w:styleId="Heading9">
     <w:name w:val="heading 9"/>
-    <w:basedOn w:val="Standard"/>
-    <w:next w:val="Standard"/>
-    <w:link w:val="berschrift9Zchn"/>
+    <w:basedOn w:val="Normal"/>
+    <w:next w:val="Normal"/>
+    <w:link w:val="Heading9Char"/>
     <w:uiPriority w:val="9"/>
     <w:semiHidden/>
     <w:unhideWhenUsed/>
@@ -1453,13 +2234,13 @@
       <w:color w:val="272727" w:themeColor="text1" w:themeTint="D8"/>
     </w:rPr>
   </w:style>
-  <w:style w:type="character" w:default="1" w:styleId="Absatz-Standardschriftart">
+  <w:style w:type="character" w:default="1" w:styleId="DefaultParagraphFont">
     <w:name w:val="Default Paragraph Font"/>
     <w:uiPriority w:val="1"/>
     <w:semiHidden/>
     <w:unhideWhenUsed/>
   </w:style>
-  <w:style w:type="table" w:default="1" w:styleId="NormaleTabelle">
+  <w:style w:type="table" w:default="1" w:styleId="TableNormal">
     <w:name w:val="Normal Table"/>
     <w:uiPriority w:val="99"/>
     <w:semiHidden/>
@@ -1474,16 +2255,16 @@
       </w:tblCellMar>
     </w:tblPr>
   </w:style>
-  <w:style w:type="numbering" w:default="1" w:styleId="KeineListe">
+  <w:style w:type="numbering" w:default="1" w:styleId="NoList">
     <w:name w:val="No List"/>
     <w:uiPriority w:val="99"/>
     <w:semiHidden/>
     <w:unhideWhenUsed/>
   </w:style>
-  <w:style w:type="character" w:customStyle="1" w:styleId="berschrift1Zchn">
-    <w:name w:val="Überschrift 1 Zchn"/>
-    <w:basedOn w:val="Absatz-Standardschriftart"/>
-    <w:link w:val="berschrift1"/>
+  <w:style w:type="character" w:customStyle="1" w:styleId="Heading1Char">
+    <w:name w:val="Heading 1 Char"/>
+    <w:basedOn w:val="DefaultParagraphFont"/>
+    <w:link w:val="Heading1"/>
     <w:uiPriority w:val="9"/>
     <w:rsid w:val="00CD4C36"/>
     <w:rPr>
@@ -1493,10 +2274,10 @@
       <w:szCs w:val="40"/>
     </w:rPr>
   </w:style>
-  <w:style w:type="character" w:customStyle="1" w:styleId="berschrift2Zchn">
-    <w:name w:val="Überschrift 2 Zchn"/>
-    <w:basedOn w:val="Absatz-Standardschriftart"/>
-    <w:link w:val="berschrift2"/>
+  <w:style w:type="character" w:customStyle="1" w:styleId="Heading2Char">
+    <w:name w:val="Heading 2 Char"/>
+    <w:basedOn w:val="DefaultParagraphFont"/>
+    <w:link w:val="Heading2"/>
     <w:uiPriority w:val="9"/>
     <w:semiHidden/>
     <w:rsid w:val="00CD4C36"/>
@@ -1507,10 +2288,10 @@
       <w:szCs w:val="32"/>
     </w:rPr>
   </w:style>
-  <w:style w:type="character" w:customStyle="1" w:styleId="berschrift3Zchn">
-    <w:name w:val="Überschrift 3 Zchn"/>
-    <w:basedOn w:val="Absatz-Standardschriftart"/>
-    <w:link w:val="berschrift3"/>
+  <w:style w:type="character" w:customStyle="1" w:styleId="Heading3Char">
+    <w:name w:val="Heading 3 Char"/>
+    <w:basedOn w:val="DefaultParagraphFont"/>
+    <w:link w:val="Heading3"/>
     <w:uiPriority w:val="9"/>
     <w:semiHidden/>
     <w:rsid w:val="00CD4C36"/>
@@ -1521,10 +2302,10 @@
       <w:szCs w:val="28"/>
     </w:rPr>
   </w:style>
-  <w:style w:type="character" w:customStyle="1" w:styleId="berschrift4Zchn">
-    <w:name w:val="Überschrift 4 Zchn"/>
-    <w:basedOn w:val="Absatz-Standardschriftart"/>
-    <w:link w:val="berschrift4"/>
+  <w:style w:type="character" w:customStyle="1" w:styleId="Heading4Char">
+    <w:name w:val="Heading 4 Char"/>
+    <w:basedOn w:val="DefaultParagraphFont"/>
+    <w:link w:val="Heading4"/>
     <w:uiPriority w:val="9"/>
     <w:semiHidden/>
     <w:rsid w:val="00CD4C36"/>
@@ -1535,10 +2316,10 @@
       <w:color w:val="2F5496" w:themeColor="accent1" w:themeShade="BF"/>
     </w:rPr>
   </w:style>
-  <w:style w:type="character" w:customStyle="1" w:styleId="berschrift5Zchn">
-    <w:name w:val="Überschrift 5 Zchn"/>
-    <w:basedOn w:val="Absatz-Standardschriftart"/>
-    <w:link w:val="berschrift5"/>
+  <w:style w:type="character" w:customStyle="1" w:styleId="Heading5Char">
+    <w:name w:val="Heading 5 Char"/>
+    <w:basedOn w:val="DefaultParagraphFont"/>
+    <w:link w:val="Heading5"/>
     <w:uiPriority w:val="9"/>
     <w:semiHidden/>
     <w:rsid w:val="00CD4C36"/>
@@ -1547,10 +2328,10 @@
       <w:color w:val="2F5496" w:themeColor="accent1" w:themeShade="BF"/>
     </w:rPr>
   </w:style>
-  <w:style w:type="character" w:customStyle="1" w:styleId="berschrift6Zchn">
-    <w:name w:val="Überschrift 6 Zchn"/>
-    <w:basedOn w:val="Absatz-Standardschriftart"/>
-    <w:link w:val="berschrift6"/>
+  <w:style w:type="character" w:customStyle="1" w:styleId="Heading6Char">
+    <w:name w:val="Heading 6 Char"/>
+    <w:basedOn w:val="DefaultParagraphFont"/>
+    <w:link w:val="Heading6"/>
     <w:uiPriority w:val="9"/>
     <w:semiHidden/>
     <w:rsid w:val="00CD4C36"/>
@@ -1561,10 +2342,10 @@
       <w:color w:val="595959" w:themeColor="text1" w:themeTint="A6"/>
     </w:rPr>
   </w:style>
-  <w:style w:type="character" w:customStyle="1" w:styleId="berschrift7Zchn">
-    <w:name w:val="Überschrift 7 Zchn"/>
-    <w:basedOn w:val="Absatz-Standardschriftart"/>
-    <w:link w:val="berschrift7"/>
+  <w:style w:type="character" w:customStyle="1" w:styleId="Heading7Char">
+    <w:name w:val="Heading 7 Char"/>
+    <w:basedOn w:val="DefaultParagraphFont"/>
+    <w:link w:val="Heading7"/>
     <w:uiPriority w:val="9"/>
     <w:semiHidden/>
     <w:rsid w:val="00CD4C36"/>
@@ -1573,10 +2354,10 @@
       <w:color w:val="595959" w:themeColor="text1" w:themeTint="A6"/>
     </w:rPr>
   </w:style>
-  <w:style w:type="character" w:customStyle="1" w:styleId="berschrift8Zchn">
-    <w:name w:val="Überschrift 8 Zchn"/>
-    <w:basedOn w:val="Absatz-Standardschriftart"/>
-    <w:link w:val="berschrift8"/>
+  <w:style w:type="character" w:customStyle="1" w:styleId="Heading8Char">
+    <w:name w:val="Heading 8 Char"/>
+    <w:basedOn w:val="DefaultParagraphFont"/>
+    <w:link w:val="Heading8"/>
     <w:uiPriority w:val="9"/>
     <w:semiHidden/>
     <w:rsid w:val="00CD4C36"/>
@@ -1587,10 +2368,10 @@
       <w:color w:val="272727" w:themeColor="text1" w:themeTint="D8"/>
     </w:rPr>
   </w:style>
-  <w:style w:type="character" w:customStyle="1" w:styleId="berschrift9Zchn">
-    <w:name w:val="Überschrift 9 Zchn"/>
-    <w:basedOn w:val="Absatz-Standardschriftart"/>
-    <w:link w:val="berschrift9"/>
+  <w:style w:type="character" w:customStyle="1" w:styleId="Heading9Char">
+    <w:name w:val="Heading 9 Char"/>
+    <w:basedOn w:val="DefaultParagraphFont"/>
+    <w:link w:val="Heading9"/>
     <w:uiPriority w:val="9"/>
     <w:semiHidden/>
     <w:rsid w:val="00CD4C36"/>
@@ -1599,11 +2380,11 @@
       <w:color w:val="272727" w:themeColor="text1" w:themeTint="D8"/>
     </w:rPr>
   </w:style>
-  <w:style w:type="paragraph" w:styleId="Titel">
+  <w:style w:type="paragraph" w:styleId="Title">
     <w:name w:val="Title"/>
-    <w:basedOn w:val="Standard"/>
-    <w:next w:val="Standard"/>
-    <w:link w:val="TitelZchn"/>
+    <w:basedOn w:val="Normal"/>
+    <w:next w:val="Normal"/>
+    <w:link w:val="TitleChar"/>
     <w:uiPriority w:val="10"/>
     <w:qFormat/>
     <w:rsid w:val="00CD4C36"/>
@@ -1619,10 +2400,10 @@
       <w:szCs w:val="56"/>
     </w:rPr>
   </w:style>
-  <w:style w:type="character" w:customStyle="1" w:styleId="TitelZchn">
-    <w:name w:val="Titel Zchn"/>
-    <w:basedOn w:val="Absatz-Standardschriftart"/>
-    <w:link w:val="Titel"/>
+  <w:style w:type="character" w:customStyle="1" w:styleId="TitleChar">
+    <w:name w:val="Title Char"/>
+    <w:basedOn w:val="DefaultParagraphFont"/>
+    <w:link w:val="Title"/>
     <w:uiPriority w:val="10"/>
     <w:rsid w:val="00CD4C36"/>
     <w:rPr>
@@ -1633,11 +2414,11 @@
       <w:szCs w:val="56"/>
     </w:rPr>
   </w:style>
-  <w:style w:type="paragraph" w:styleId="Untertitel">
+  <w:style w:type="paragraph" w:styleId="Subtitle">
     <w:name w:val="Subtitle"/>
-    <w:basedOn w:val="Standard"/>
-    <w:next w:val="Standard"/>
-    <w:link w:val="UntertitelZchn"/>
+    <w:basedOn w:val="Normal"/>
+    <w:next w:val="Normal"/>
+    <w:link w:val="SubtitleChar"/>
     <w:uiPriority w:val="11"/>
     <w:qFormat/>
     <w:rsid w:val="00CD4C36"/>
@@ -1654,10 +2435,10 @@
       <w:szCs w:val="28"/>
     </w:rPr>
   </w:style>
-  <w:style w:type="character" w:customStyle="1" w:styleId="UntertitelZchn">
-    <w:name w:val="Untertitel Zchn"/>
-    <w:basedOn w:val="Absatz-Standardschriftart"/>
-    <w:link w:val="Untertitel"/>
+  <w:style w:type="character" w:customStyle="1" w:styleId="SubtitleChar">
+    <w:name w:val="Subtitle Char"/>
+    <w:basedOn w:val="DefaultParagraphFont"/>
+    <w:link w:val="Subtitle"/>
     <w:uiPriority w:val="11"/>
     <w:rsid w:val="00CD4C36"/>
     <w:rPr>
@@ -1668,11 +2449,11 @@
       <w:szCs w:val="28"/>
     </w:rPr>
   </w:style>
-  <w:style w:type="paragraph" w:styleId="Zitat">
+  <w:style w:type="paragraph" w:styleId="Quote">
     <w:name w:val="Quote"/>
-    <w:basedOn w:val="Standard"/>
-    <w:next w:val="Standard"/>
-    <w:link w:val="ZitatZchn"/>
+    <w:basedOn w:val="Normal"/>
+    <w:next w:val="Normal"/>
+    <w:link w:val="QuoteChar"/>
     <w:uiPriority w:val="29"/>
     <w:qFormat/>
     <w:rsid w:val="00CD4C36"/>
@@ -1686,10 +2467,10 @@
       <w:color w:val="404040" w:themeColor="text1" w:themeTint="BF"/>
     </w:rPr>
   </w:style>
-  <w:style w:type="character" w:customStyle="1" w:styleId="ZitatZchn">
-    <w:name w:val="Zitat Zchn"/>
-    <w:basedOn w:val="Absatz-Standardschriftart"/>
-    <w:link w:val="Zitat"/>
+  <w:style w:type="character" w:customStyle="1" w:styleId="QuoteChar">
+    <w:name w:val="Quote Char"/>
+    <w:basedOn w:val="DefaultParagraphFont"/>
+    <w:link w:val="Quote"/>
     <w:uiPriority w:val="29"/>
     <w:rsid w:val="00CD4C36"/>
     <w:rPr>
@@ -1698,9 +2479,9 @@
       <w:color w:val="404040" w:themeColor="text1" w:themeTint="BF"/>
     </w:rPr>
   </w:style>
-  <w:style w:type="paragraph" w:styleId="Listenabsatz">
+  <w:style w:type="paragraph" w:styleId="ListParagraph">
     <w:name w:val="List Paragraph"/>
-    <w:basedOn w:val="Standard"/>
+    <w:basedOn w:val="Normal"/>
     <w:uiPriority w:val="34"/>
     <w:qFormat/>
     <w:rsid w:val="00CD4C36"/>
@@ -1709,9 +2490,9 @@
       <w:contextualSpacing/>
     </w:pPr>
   </w:style>
-  <w:style w:type="character" w:styleId="IntensiveHervorhebung">
+  <w:style w:type="character" w:styleId="IntenseEmphasis">
     <w:name w:val="Intense Emphasis"/>
-    <w:basedOn w:val="Absatz-Standardschriftart"/>
+    <w:basedOn w:val="DefaultParagraphFont"/>
     <w:uiPriority w:val="21"/>
     <w:qFormat/>
     <w:rsid w:val="00CD4C36"/>
@@ -1721,11 +2502,11 @@
       <w:color w:val="2F5496" w:themeColor="accent1" w:themeShade="BF"/>
     </w:rPr>
   </w:style>
-  <w:style w:type="paragraph" w:styleId="IntensivesZitat">
+  <w:style w:type="paragraph" w:styleId="IntenseQuote">
     <w:name w:val="Intense Quote"/>
-    <w:basedOn w:val="Standard"/>
-    <w:next w:val="Standard"/>
-    <w:link w:val="IntensivesZitatZchn"/>
+    <w:basedOn w:val="Normal"/>
+    <w:next w:val="Normal"/>
+    <w:link w:val="IntenseQuoteChar"/>
     <w:uiPriority w:val="30"/>
     <w:qFormat/>
     <w:rsid w:val="00CD4C36"/>
@@ -1744,10 +2525,10 @@
       <w:color w:val="2F5496" w:themeColor="accent1" w:themeShade="BF"/>
     </w:rPr>
   </w:style>
-  <w:style w:type="character" w:customStyle="1" w:styleId="IntensivesZitatZchn">
-    <w:name w:val="Intensives Zitat Zchn"/>
-    <w:basedOn w:val="Absatz-Standardschriftart"/>
-    <w:link w:val="IntensivesZitat"/>
+  <w:style w:type="character" w:customStyle="1" w:styleId="IntenseQuoteChar">
+    <w:name w:val="Intense Quote Char"/>
+    <w:basedOn w:val="DefaultParagraphFont"/>
+    <w:link w:val="IntenseQuote"/>
     <w:uiPriority w:val="30"/>
     <w:rsid w:val="00CD4C36"/>
     <w:rPr>
@@ -1756,9 +2537,9 @@
       <w:color w:val="2F5496" w:themeColor="accent1" w:themeShade="BF"/>
     </w:rPr>
   </w:style>
-  <w:style w:type="character" w:styleId="IntensiverVerweis">
+  <w:style w:type="character" w:styleId="IntenseReference">
     <w:name w:val="Intense Reference"/>
-    <w:basedOn w:val="Absatz-Standardschriftart"/>
+    <w:basedOn w:val="DefaultParagraphFont"/>
     <w:uiPriority w:val="32"/>
     <w:qFormat/>
     <w:rsid w:val="00CD4C36"/>
@@ -1770,9 +2551,9 @@
       <w:spacing w:val="5"/>
     </w:rPr>
   </w:style>
-  <w:style w:type="table" w:styleId="Tabellenraster">
+  <w:style w:type="table" w:styleId="TableGrid">
     <w:name w:val="Table Grid"/>
-    <w:basedOn w:val="NormaleTabelle"/>
+    <w:basedOn w:val="TableNormal"/>
     <w:uiPriority w:val="39"/>
     <w:rsid w:val="008650D7"/>
     <w:pPr>
@@ -1789,10 +2570,10 @@
       </w:tblBorders>
     </w:tblPr>
   </w:style>
-  <w:style w:type="paragraph" w:styleId="Beschriftung">
+  <w:style w:type="paragraph" w:styleId="Caption">
     <w:name w:val="caption"/>
-    <w:basedOn w:val="Standard"/>
-    <w:next w:val="Standard"/>
+    <w:basedOn w:val="Normal"/>
+    <w:next w:val="Normal"/>
     <w:uiPriority w:val="35"/>
     <w:unhideWhenUsed/>
     <w:qFormat/>

</xml_diff>

<commit_message>
- changes one line in protocol
</commit_message>
<xml_diff>
--- a/report_assets/project-report.docx
+++ b/report_assets/project-report.docx
@@ -38,8 +38,13 @@
           <w:numId w:val="2"/>
         </w:numPr>
       </w:pPr>
-      <w:r>
-        <w:t>0 : real image</w:t>
+      <w:proofErr w:type="gramStart"/>
+      <w:r>
+        <w:t>0 :</w:t>
+      </w:r>
+      <w:proofErr w:type="gramEnd"/>
+      <w:r>
+        <w:t xml:space="preserve"> real image</w:t>
       </w:r>
     </w:p>
     <w:p>
@@ -50,13 +55,26 @@
           <w:numId w:val="2"/>
         </w:numPr>
       </w:pPr>
-      <w:r>
-        <w:t>1 : AI-generated image</w:t>
-      </w:r>
-    </w:p>
-    <w:p>
-      <w:r>
-        <w:t>We implemented the project in Python with TensorFlow/Keras, OpenCV, NumPy, Matplotlib, and scikit-learn. The final model is a custom designed and trained CNN learning model.</w:t>
+      <w:proofErr w:type="gramStart"/>
+      <w:r>
+        <w:t>1 :</w:t>
+      </w:r>
+      <w:proofErr w:type="gramEnd"/>
+      <w:r>
+        <w:t xml:space="preserve"> AI-generated image</w:t>
+      </w:r>
+    </w:p>
+    <w:p>
+      <w:r>
+        <w:t>We implemented the project in Python with TensorFlow/</w:t>
+      </w:r>
+      <w:proofErr w:type="spellStart"/>
+      <w:r>
+        <w:t>Keras</w:t>
+      </w:r>
+      <w:proofErr w:type="spellEnd"/>
+      <w:r>
+        <w:t>, OpenCV, NumPy, Matplotlib, and scikit-learn. The final model is a custom designed and trained CNN learning model.</w:t>
       </w:r>
     </w:p>
     <w:p>
@@ -73,10 +91,36 @@
     </w:p>
     <w:p>
       <w:r>
-        <w:t>The dataset we used is the Kaggle dataset rhythmghai/ai-vs-real-images-dataset</w:t>
-      </w:r>
-      <w:r>
-        <w:t>. Accordint to the dataset description, the real images were collected from Unsplash and the synthetic images were generated with Stable Diffusion SDXL. The images are grouped into five semantic categories (animals, city, food, nature and people)</w:t>
+        <w:t xml:space="preserve">The dataset we used is the Kaggle dataset </w:t>
+      </w:r>
+      <w:proofErr w:type="spellStart"/>
+      <w:r>
+        <w:t>rhythmghai</w:t>
+      </w:r>
+      <w:proofErr w:type="spellEnd"/>
+      <w:r>
+        <w:t>/ai-vs-real-images-dataset</w:t>
+      </w:r>
+      <w:r>
+        <w:t xml:space="preserve">. </w:t>
+      </w:r>
+      <w:proofErr w:type="spellStart"/>
+      <w:r>
+        <w:t>Accordint</w:t>
+      </w:r>
+      <w:proofErr w:type="spellEnd"/>
+      <w:r>
+        <w:t xml:space="preserve"> to the dataset description, the real images were collected from </w:t>
+      </w:r>
+      <w:proofErr w:type="spellStart"/>
+      <w:proofErr w:type="gramStart"/>
+      <w:r>
+        <w:t>Unsplash</w:t>
+      </w:r>
+      <w:proofErr w:type="spellEnd"/>
+      <w:proofErr w:type="gramEnd"/>
+      <w:r>
+        <w:t xml:space="preserve"> and the synthetic images were generated with Stable Diffusion SDXL. The images are grouped into five semantic categories (animals, city, food, nature and people)</w:t>
       </w:r>
       <w:r>
         <w:t>.</w:t>
@@ -563,7 +607,7 @@
         </w:rPr>
         <w:lastRenderedPageBreak/>
         <w:drawing>
-          <wp:inline distT="0" distB="0" distL="0" distR="0" wp14:anchorId="33ACDDDA" wp14:editId="120F5058">
+          <wp:inline distT="0" distB="0" distL="0" distR="0" wp14:anchorId="33ACDDDA" wp14:editId="3ED0CE9B">
             <wp:extent cx="5495925" cy="3301212"/>
             <wp:effectExtent l="0" t="0" r="0" b="0"/>
             <wp:docPr id="1391844465" name="Grafik 1"/>
@@ -651,7 +695,15 @@
         </w:numPr>
       </w:pPr>
       <w:r>
-        <w:t>Images from ‘real_dataset/’ labeled ‘0’</w:t>
+        <w:t>Images from ‘</w:t>
+      </w:r>
+      <w:proofErr w:type="spellStart"/>
+      <w:r>
+        <w:t>real_dataset</w:t>
+      </w:r>
+      <w:proofErr w:type="spellEnd"/>
+      <w:r>
+        <w:t>/’ labeled ‘0’</w:t>
       </w:r>
     </w:p>
     <w:p>
@@ -663,12 +715,28 @@
         </w:numPr>
       </w:pPr>
       <w:r>
-        <w:t>Images from ‘Ai_generated_dataset/’ labeled ‘1’</w:t>
-      </w:r>
-    </w:p>
-    <w:p>
-      <w:r>
-        <w:t>Stratified sampling was used to split the dataset so each split preserved the original class ratio:</w:t>
+        <w:t>Images from ‘</w:t>
+      </w:r>
+      <w:proofErr w:type="spellStart"/>
+      <w:r>
+        <w:t>Ai_generated_dataset</w:t>
+      </w:r>
+      <w:proofErr w:type="spellEnd"/>
+      <w:r>
+        <w:t>/’ labeled ‘1’</w:t>
+      </w:r>
+    </w:p>
+    <w:p>
+      <w:r>
+        <w:t xml:space="preserve">Stratified sampling was used to split the </w:t>
+      </w:r>
+      <w:proofErr w:type="gramStart"/>
+      <w:r>
+        <w:t>dataset</w:t>
+      </w:r>
+      <w:proofErr w:type="gramEnd"/>
+      <w:r>
+        <w:t xml:space="preserve"> so each split preserved the original class ratio:</w:t>
       </w:r>
     </w:p>
     <w:tbl>
@@ -963,7 +1031,21 @@
     </w:p>
     <w:p>
       <w:r>
-        <w:t>The final classifier is a custom CNN with five convolutional blocks followed by global average pooling and dense classification layers. Each convolutional block uses two 3x3 convolution layers, batch normalization, ReLU activation, max pooling and dropout.</w:t>
+        <w:t xml:space="preserve">The final classifier is a custom CNN with five convolutional blocks followed by global average pooling and dense classification layers. Each convolutional block uses two 3x3 convolution layers, batch normalization, </w:t>
+      </w:r>
+      <w:proofErr w:type="spellStart"/>
+      <w:r>
+        <w:t>ReLU</w:t>
+      </w:r>
+      <w:proofErr w:type="spellEnd"/>
+      <w:r>
+        <w:t xml:space="preserve"> activation, max pooling and dropout</w:t>
+      </w:r>
+      <w:r>
+        <w:t xml:space="preserve"> in the last classification block</w:t>
+      </w:r>
+      <w:r>
+        <w:t>.</w:t>
       </w:r>
     </w:p>
     <w:p>
@@ -993,7 +1075,15 @@
     </w:p>
     <w:p>
       <w:r>
-        <w:t>ai_vs_real_best_weights.weights.h5</w:t>
+        <w:t>ai_vs_real_best_</w:t>
+      </w:r>
+      <w:proofErr w:type="gramStart"/>
+      <w:r>
+        <w:t>weights.weights</w:t>
+      </w:r>
+      <w:proofErr w:type="gramEnd"/>
+      <w:r>
+        <w:t>.h5</w:t>
       </w:r>
     </w:p>
     <w:p>
@@ -1300,7 +1390,7 @@
           <w:noProof/>
         </w:rPr>
         <w:drawing>
-          <wp:inline distT="0" distB="0" distL="0" distR="0" wp14:anchorId="67785271" wp14:editId="23F014B0">
+          <wp:inline distT="0" distB="0" distL="0" distR="0" wp14:anchorId="67785271" wp14:editId="2316DAB3">
             <wp:extent cx="4587240" cy="3440684"/>
             <wp:effectExtent l="0" t="0" r="3810" b="7620"/>
             <wp:docPr id="1756644641" name="Picture 3"/>
@@ -1357,9 +1447,14 @@
           <w:numId w:val="1"/>
         </w:numPr>
       </w:pPr>
+      <w:proofErr w:type="gramStart"/>
       <w:r>
         <w:lastRenderedPageBreak/>
-        <w:t>Real-World Relevance</w:t>
+        <w:t>Real-World</w:t>
+      </w:r>
+      <w:proofErr w:type="gramEnd"/>
+      <w:r>
+        <w:t xml:space="preserve"> Relevance</w:t>
       </w:r>
     </w:p>
     <w:p>
@@ -1386,8 +1481,15 @@
       </w:r>
     </w:p>
     <w:p>
-      <w:r>
-        <w:t>Therefor, AI-image detection tools should be seen as indicators rather than fully reliable proof of real vs. AI-images.</w:t>
+      <w:proofErr w:type="spellStart"/>
+      <w:proofErr w:type="gramStart"/>
+      <w:r>
+        <w:t>Therefor</w:t>
+      </w:r>
+      <w:proofErr w:type="spellEnd"/>
+      <w:proofErr w:type="gramEnd"/>
+      <w:r>
+        <w:t>, AI-image detection tools should be seen as indicators rather than fully reliable proof of real vs. AI-images.</w:t>
       </w:r>
     </w:p>
     <w:p>
@@ -1409,7 +1511,15 @@
     </w:p>
     <w:p>
       <w:r>
-        <w:t>Another challenge was that the dataset is relatively small. A CNN with millions of parameters can easily overfit when trained on too few images. To reduce this risk we expanded the training data with augmentation and added dropout after pooling, dense layers and batch normalization after convolutional/dense layers.</w:t>
+        <w:t xml:space="preserve">Another challenge was that the dataset is relatively small. A CNN with millions of parameters can easily overfit when trained on too few images. To reduce this </w:t>
+      </w:r>
+      <w:proofErr w:type="gramStart"/>
+      <w:r>
+        <w:t>risk</w:t>
+      </w:r>
+      <w:proofErr w:type="gramEnd"/>
+      <w:r>
+        <w:t xml:space="preserve"> we expanded the training data with augmentation and added dropout after pooling, dense layers and batch normalization after convolutional/dense layers.</w:t>
       </w:r>
     </w:p>
     <w:sectPr>

</xml_diff>